<commit_message>
Use ranklist template by default
Make ranklist.docx the default template for ranking list exports and add a conditional to use eternal_list_of_the_best.docx when $printEternalListOfTheBest is true. Normalize readonly constructor formatting in Chronometry and ChronometryHelper to single-line signatures. Update composer.json to accept markocupic/contao-component-fontawesome-free ^6.0 || ^7.0 and add package "version": "3.0". Add/rename several docx templates (updated certificate, ranklist, eternal_list_of_the_best and new old_* backups).
</commit_message>
<xml_diff>
--- a/docx/certificate.docx
+++ b/docx/certificate.docx
@@ -67,7 +67,7 @@
           <w:szCs w:val="36"/>
           <w:lang w:val="de-CH"/>
         </w:rPr>
-        <w:t>1</w:t>
+        <w:t>2</w:t>
       </w:r>
       <w:r>
         <w:rPr>
@@ -76,7 +76,7 @@
           <w:szCs w:val="36"/>
           <w:lang w:val="de-CH"/>
         </w:rPr>
-        <w:t>9</w:t>
+        <w:t xml:space="preserve">. </w:t>
       </w:r>
       <w:r>
         <w:rPr>
@@ -85,16 +85,7 @@
           <w:szCs w:val="36"/>
           <w:lang w:val="de-CH"/>
         </w:rPr>
-        <w:t xml:space="preserve">. </w:t>
-      </w:r>
-      <w:r>
-        <w:rPr>
-          <w:rFonts w:ascii="Century Gothic" w:hAnsi="Century Gothic"/>
-          <w:sz w:val="36"/>
-          <w:szCs w:val="36"/>
-          <w:lang w:val="de-CH"/>
-        </w:rPr>
-        <w:t>Mai</w:t>
+        <w:t>Juni</w:t>
       </w:r>
       <w:r>
         <w:rPr>
@@ -313,6 +304,35 @@
           <w:lang w:val="de-CH"/>
         </w:rPr>
       </w:pPr>
+      <w:r>
+        <w:rPr>
+          <w:rFonts w:ascii="Century Gothic" w:hAnsi="Century Gothic"/>
+          <w:sz w:val="44"/>
+          <w:szCs w:val="44"/>
+          <w:lang w:val="de-CH"/>
+        </w:rPr>
+        <w:t>Kategorie: ${</w:t>
+      </w:r>
+      <w:proofErr w:type="spellStart"/>
+      <w:r>
+        <w:rPr>
+          <w:rFonts w:ascii="Century Gothic" w:hAnsi="Century Gothic"/>
+          <w:sz w:val="44"/>
+          <w:szCs w:val="44"/>
+          <w:lang w:val="de-CH"/>
+        </w:rPr>
+        <w:t>category</w:t>
+      </w:r>
+      <w:proofErr w:type="spellEnd"/>
+      <w:r>
+        <w:rPr>
+          <w:rFonts w:ascii="Century Gothic" w:hAnsi="Century Gothic"/>
+          <w:sz w:val="44"/>
+          <w:szCs w:val="44"/>
+          <w:lang w:val="de-CH"/>
+        </w:rPr>
+        <w:t>}</w:t>
+      </w:r>
     </w:p>
     <w:p>
       <w:pPr>
@@ -330,35 +350,15 @@
           <w:szCs w:val="44"/>
           <w:lang w:val="de-CH"/>
         </w:rPr>
-        <w:t>Kategorie: ${</w:t>
-      </w:r>
-      <w:proofErr w:type="spellStart"/>
-      <w:r>
-        <w:rPr>
-          <w:rFonts w:ascii="Century Gothic" w:hAnsi="Century Gothic"/>
-          <w:sz w:val="44"/>
-          <w:szCs w:val="44"/>
-          <w:lang w:val="de-CH"/>
-        </w:rPr>
-        <w:t>category</w:t>
-      </w:r>
-      <w:proofErr w:type="spellEnd"/>
-      <w:r>
-        <w:rPr>
-          <w:rFonts w:ascii="Century Gothic" w:hAnsi="Century Gothic"/>
-          <w:sz w:val="44"/>
-          <w:szCs w:val="44"/>
-          <w:lang w:val="de-CH"/>
-        </w:rPr>
-        <w:t>}</w:t>
+        <w:t>Zeit: ${time}</w:t>
       </w:r>
     </w:p>
     <w:p>
       <w:pPr>
         <w:rPr>
           <w:rFonts w:ascii="Century Gothic" w:hAnsi="Century Gothic"/>
-          <w:sz w:val="44"/>
-          <w:szCs w:val="44"/>
+          <w:sz w:val="18"/>
+          <w:szCs w:val="18"/>
           <w:lang w:val="de-CH"/>
         </w:rPr>
       </w:pPr>
@@ -367,27 +367,76 @@
       <w:pPr>
         <w:rPr>
           <w:rFonts w:ascii="Century Gothic" w:hAnsi="Century Gothic"/>
-          <w:sz w:val="44"/>
-          <w:szCs w:val="44"/>
-          <w:lang w:val="de-CH"/>
-        </w:rPr>
-      </w:pPr>
-      <w:r>
-        <w:rPr>
-          <w:rFonts w:ascii="Century Gothic" w:hAnsi="Century Gothic"/>
-          <w:sz w:val="44"/>
-          <w:szCs w:val="44"/>
-          <w:lang w:val="de-CH"/>
-        </w:rPr>
-        <w:t>Zeit: ${time}</w:t>
+          <w:sz w:val="28"/>
+          <w:szCs w:val="28"/>
+          <w:lang w:val="de-CH"/>
+        </w:rPr>
+      </w:pPr>
+      <w:r>
+        <w:rPr>
+          <w:rFonts w:ascii="Century Gothic" w:hAnsi="Century Gothic"/>
+          <w:sz w:val="28"/>
+          <w:szCs w:val="28"/>
+          <w:lang w:val="de-CH"/>
+        </w:rPr>
+        <w:t>${</w:t>
+      </w:r>
+      <w:proofErr w:type="spellStart"/>
+      <w:r>
+        <w:rPr>
+          <w:rFonts w:ascii="Century Gothic" w:hAnsi="Century Gothic"/>
+          <w:sz w:val="28"/>
+          <w:szCs w:val="28"/>
+          <w:lang w:val="de-CH"/>
+        </w:rPr>
+        <w:t>firstname</w:t>
+      </w:r>
+      <w:proofErr w:type="spellEnd"/>
+      <w:r>
+        <w:rPr>
+          <w:rFonts w:ascii="Century Gothic" w:hAnsi="Century Gothic"/>
+          <w:sz w:val="28"/>
+          <w:szCs w:val="28"/>
+          <w:lang w:val="de-CH"/>
+        </w:rPr>
+        <w:t>}, g</w:t>
+      </w:r>
+      <w:r>
+        <w:rPr>
+          <w:rFonts w:ascii="Century Gothic" w:hAnsi="Century Gothic"/>
+          <w:sz w:val="28"/>
+          <w:szCs w:val="28"/>
+          <w:lang w:val="de-CH"/>
+        </w:rPr>
+        <w:t xml:space="preserve">anz herzliche Gratulation zu dieser </w:t>
+      </w:r>
+      <w:proofErr w:type="gramStart"/>
+      <w:r>
+        <w:rPr>
+          <w:rFonts w:ascii="Century Gothic" w:hAnsi="Century Gothic"/>
+          <w:sz w:val="28"/>
+          <w:szCs w:val="28"/>
+          <w:lang w:val="de-CH"/>
+        </w:rPr>
+        <w:t>tollen</w:t>
+      </w:r>
+      <w:proofErr w:type="gramEnd"/>
+      <w:r>
+        <w:rPr>
+          <w:rFonts w:ascii="Century Gothic" w:hAnsi="Century Gothic"/>
+          <w:sz w:val="28"/>
+          <w:szCs w:val="28"/>
+          <w:lang w:val="de-CH"/>
+        </w:rPr>
+        <w:t xml:space="preserve"> Leistung!</w:t>
       </w:r>
     </w:p>
     <w:p>
       <w:pPr>
         <w:rPr>
           <w:rFonts w:ascii="Century Gothic" w:hAnsi="Century Gothic"/>
-          <w:sz w:val="18"/>
-          <w:szCs w:val="18"/>
+          <w:sz w:val="28"/>
+          <w:szCs w:val="28"/>
           <w:lang w:val="de-CH"/>
         </w:rPr>
       </w:pPr>
@@ -396,8 +445,8 @@
       <w:pPr>
         <w:rPr>
           <w:rFonts w:ascii="Century Gothic" w:hAnsi="Century Gothic"/>
-          <w:sz w:val="18"/>
-          <w:szCs w:val="18"/>
+          <w:sz w:val="28"/>
+          <w:szCs w:val="28"/>
           <w:lang w:val="de-CH"/>
         </w:rPr>
       </w:pPr>
@@ -406,16 +455,6 @@
       <w:pPr>
         <w:rPr>
           <w:rFonts w:ascii="Century Gothic" w:hAnsi="Century Gothic"/>
-          <w:sz w:val="18"/>
-          <w:szCs w:val="18"/>
-          <w:lang w:val="de-CH"/>
-        </w:rPr>
-      </w:pPr>
-    </w:p>
-    <w:p>
-      <w:pPr>
-        <w:rPr>
-          <w:rFonts w:ascii="Century Gothic" w:hAnsi="Century Gothic"/>
           <w:sz w:val="28"/>
           <w:szCs w:val="28"/>
           <w:lang w:val="de-CH"/>
@@ -424,62 +463,292 @@
       <w:r>
         <w:rPr>
           <w:rFonts w:ascii="Century Gothic" w:hAnsi="Century Gothic"/>
+          <w:noProof/>
           <w:sz w:val="28"/>
           <w:szCs w:val="28"/>
           <w:lang w:val="de-CH"/>
         </w:rPr>
-        <w:t>${</w:t>
-      </w:r>
-      <w:proofErr w:type="spellStart"/>
-      <w:r>
-        <w:rPr>
-          <w:rFonts w:ascii="Century Gothic" w:hAnsi="Century Gothic"/>
+        <mc:AlternateContent>
+          <mc:Choice Requires="wpi">
+            <w:drawing>
+              <wp:anchor distT="0" distB="0" distL="114300" distR="114300" simplePos="0" relativeHeight="251681792" behindDoc="0" locked="0" layoutInCell="1" allowOverlap="1" wp14:anchorId="567EC854" wp14:editId="67E812EA">
+                <wp:simplePos x="0" y="0"/>
+                <wp:positionH relativeFrom="column">
+                  <wp:posOffset>3318510</wp:posOffset>
+                </wp:positionH>
+                <wp:positionV relativeFrom="paragraph">
+                  <wp:posOffset>-106045</wp:posOffset>
+                </wp:positionV>
+                <wp:extent cx="2611195" cy="555625"/>
+                <wp:effectExtent l="57150" t="57150" r="36830" b="73025"/>
+                <wp:wrapNone/>
+                <wp:docPr id="776388416" name="Freihand 36"/>
+                <wp:cNvGraphicFramePr/>
+                <a:graphic xmlns:a="http://schemas.openxmlformats.org/drawingml/2006/main">
+                  <a:graphicData uri="http://schemas.microsoft.com/office/word/2010/wordprocessingInk">
+                    <w14:contentPart bwMode="auto" r:id="rId8">
+                      <w14:nvContentPartPr>
+                        <w14:cNvContentPartPr/>
+                      </w14:nvContentPartPr>
+                      <w14:xfrm>
+                        <a:off x="0" y="0"/>
+                        <a:ext cx="2611195" cy="555625"/>
+                      </w14:xfrm>
+                    </w14:contentPart>
+                  </a:graphicData>
+                </a:graphic>
+              </wp:anchor>
+            </w:drawing>
+          </mc:Choice>
+          <mc:Fallback>
+            <w:pict>
+              <v:shapetype w14:anchorId="36A22C6B" id="_x0000_t75" coordsize="21600,21600" o:spt="75" o:preferrelative="t" path="m@4@5l@4@11@9@11@9@5xe" filled="f" stroked="f">
+                <v:stroke joinstyle="miter"/>
+                <v:formulas>
+                  <v:f eqn="if lineDrawn pixelLineWidth 0"/>
+                  <v:f eqn="sum @0 1 0"/>
+                  <v:f eqn="sum 0 0 @1"/>
+                  <v:f eqn="prod @2 1 2"/>
+                  <v:f eqn="prod @3 21600 pixelWidth"/>
+                  <v:f eqn="prod @3 21600 pixelHeight"/>
+                  <v:f eqn="sum @0 0 1"/>
+                  <v:f eqn="prod @6 1 2"/>
+                  <v:f eqn="prod @7 21600 pixelWidth"/>
+                  <v:f eqn="sum @8 21600 0"/>
+                  <v:f eqn="prod @7 21600 pixelHeight"/>
+                  <v:f eqn="sum @10 21600 0"/>
+                </v:formulas>
+                <v:path o:extrusionok="f" gradientshapeok="t" o:connecttype="rect"/>
+                <o:lock v:ext="edit" aspectratio="t"/>
+              </v:shapetype>
+              <v:shape id="Freihand 36" o:spid="_x0000_s1026" type="#_x0000_t75" style="position:absolute;margin-left:259.9pt;margin-top:-9.75pt;width:208.4pt;height:46.55pt;z-index:251681792;visibility:visible;mso-wrap-style:square;mso-wrap-distance-left:9pt;mso-wrap-distance-top:0;mso-wrap-distance-right:9pt;mso-wrap-distance-bottom:0;mso-position-horizontal:absolute;mso-position-horizontal-relative:text;mso-position-vertical:absolute;mso-position-vertical-relative:text" o:gfxdata="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">
+                <v:imagedata r:id="rId9" o:title=""/>
+              </v:shape>
+            </w:pict>
+          </mc:Fallback>
+        </mc:AlternateContent>
+      </w:r>
+      <w:r>
+        <w:rPr>
+          <w:rFonts w:ascii="Century Gothic" w:hAnsi="Century Gothic"/>
+          <w:noProof/>
           <w:sz w:val="28"/>
           <w:szCs w:val="28"/>
           <w:lang w:val="de-CH"/>
         </w:rPr>
-        <w:t>firstname</w:t>
-      </w:r>
-      <w:proofErr w:type="spellEnd"/>
-      <w:r>
-        <w:rPr>
-          <w:rFonts w:ascii="Century Gothic" w:hAnsi="Century Gothic"/>
-          <w:sz w:val="28"/>
-          <w:szCs w:val="28"/>
-          <w:lang w:val="de-CH"/>
-        </w:rPr>
-        <w:t>}, g</w:t>
-      </w:r>
-      <w:r>
-        <w:rPr>
-          <w:rFonts w:ascii="Century Gothic" w:hAnsi="Century Gothic"/>
-          <w:sz w:val="28"/>
-          <w:szCs w:val="28"/>
-          <w:lang w:val="de-CH"/>
-        </w:rPr>
-        <w:t xml:space="preserve">anz herzliche Gratulation zu dieser </w:t>
-      </w:r>
-      <w:proofErr w:type="gramStart"/>
-      <w:r>
-        <w:rPr>
-          <w:rFonts w:ascii="Century Gothic" w:hAnsi="Century Gothic"/>
-          <w:sz w:val="28"/>
-          <w:szCs w:val="28"/>
-          <w:lang w:val="de-CH"/>
-        </w:rPr>
-        <w:t>tollen</w:t>
-      </w:r>
-      <w:proofErr w:type="gramEnd"/>
-      <w:r>
-        <w:rPr>
-          <w:rFonts w:ascii="Century Gothic" w:hAnsi="Century Gothic"/>
-          <w:sz w:val="28"/>
-          <w:szCs w:val="28"/>
-          <w:lang w:val="de-CH"/>
-        </w:rPr>
-        <w:t xml:space="preserve"> Leistung!</w:t>
+        <mc:AlternateContent>
+          <mc:Choice Requires="wpi">
+            <w:drawing>
+              <wp:anchor distT="0" distB="0" distL="114300" distR="114300" simplePos="0" relativeHeight="251664384" behindDoc="0" locked="0" layoutInCell="1" allowOverlap="1" wp14:anchorId="48A21EA4" wp14:editId="1681203A">
+                <wp:simplePos x="0" y="0"/>
+                <wp:positionH relativeFrom="column">
+                  <wp:posOffset>260985</wp:posOffset>
+                </wp:positionH>
+                <wp:positionV relativeFrom="paragraph">
+                  <wp:posOffset>-322580</wp:posOffset>
+                </wp:positionV>
+                <wp:extent cx="1649745" cy="840960"/>
+                <wp:effectExtent l="76200" t="76200" r="26670" b="73660"/>
+                <wp:wrapNone/>
+                <wp:docPr id="985535067" name="Freihand 27"/>
+                <wp:cNvGraphicFramePr/>
+                <a:graphic xmlns:a="http://schemas.openxmlformats.org/drawingml/2006/main">
+                  <a:graphicData uri="http://schemas.microsoft.com/office/word/2010/wordprocessingInk">
+                    <w14:contentPart bwMode="auto" r:id="rId10">
+                      <w14:nvContentPartPr>
+                        <w14:cNvContentPartPr/>
+                      </w14:nvContentPartPr>
+                      <w14:xfrm>
+                        <a:off x="0" y="0"/>
+                        <a:ext cx="1649745" cy="840960"/>
+                      </w14:xfrm>
+                    </w14:contentPart>
+                  </a:graphicData>
+                </a:graphic>
+              </wp:anchor>
+            </w:drawing>
+          </mc:Choice>
+          <mc:Fallback>
+            <w:pict>
+              <v:shapetype w14:anchorId="2D8BDFEE" id="_x0000_t75" coordsize="21600,21600" o:spt="75" o:preferrelative="t" path="m@4@5l@4@11@9@11@9@5xe" filled="f" stroked="f">
+                <v:stroke joinstyle="miter"/>
+                <v:formulas>
+                  <v:f eqn="if lineDrawn pixelLineWidth 0"/>
+                  <v:f eqn="sum @0 1 0"/>
+                  <v:f eqn="sum 0 0 @1"/>
+                  <v:f eqn="prod @2 1 2"/>
+                  <v:f eqn="prod @3 21600 pixelWidth"/>
+                  <v:f eqn="prod @3 21600 pixelHeight"/>
+                  <v:f eqn="sum @0 0 1"/>
+                  <v:f eqn="prod @6 1 2"/>
+                  <v:f eqn="prod @7 21600 pixelWidth"/>
+                  <v:f eqn="sum @8 21600 0"/>
+                  <v:f eqn="prod @7 21600 pixelHeight"/>
+                  <v:f eqn="sum @10 21600 0"/>
+                </v:formulas>
+                <v:path o:extrusionok="f" gradientshapeok="t" o:connecttype="rect"/>
+                <o:lock v:ext="edit" aspectratio="t"/>
+              </v:shapetype>
+              <v:shape id="Freihand 27" o:spid="_x0000_s1026" type="#_x0000_t75" style="position:absolute;margin-left:19.15pt;margin-top:-26.8pt;width:132.7pt;height:69pt;z-index:251664384;visibility:visible;mso-wrap-style:square;mso-wrap-distance-left:9pt;mso-wrap-distance-top:0;mso-wrap-distance-right:9pt;mso-wrap-distance-bottom:0;mso-position-horizontal:absolute;mso-position-horizontal-relative:text;mso-position-vertical:absolute;mso-position-vertical-relative:text" o:gfxdata="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">
+                <v:imagedata r:id="rId11" o:title=""/>
+              </v:shape>
+            </w:pict>
+          </mc:Fallback>
+        </mc:AlternateContent>
       </w:r>
     </w:p>
+    <w:tbl>
+      <w:tblPr>
+        <w:tblStyle w:val="Tabellenraster"/>
+        <w:tblW w:w="9072" w:type="dxa"/>
+        <w:tblBorders>
+          <w:top w:val="none" w:sz="0" w:space="0" w:color="auto"/>
+          <w:left w:val="none" w:sz="0" w:space="0" w:color="auto"/>
+          <w:bottom w:val="none" w:sz="0" w:space="0" w:color="auto"/>
+          <w:right w:val="none" w:sz="0" w:space="0" w:color="auto"/>
+          <w:insideH w:val="none" w:sz="0" w:space="0" w:color="auto"/>
+          <w:insideV w:val="none" w:sz="0" w:space="0" w:color="auto"/>
+        </w:tblBorders>
+        <w:tblLayout w:type="fixed"/>
+        <w:tblLook w:val="04A0" w:firstRow="1" w:lastRow="0" w:firstColumn="1" w:lastColumn="0" w:noHBand="0" w:noVBand="1"/>
+      </w:tblPr>
+      <w:tblGrid>
+        <w:gridCol w:w="3938"/>
+        <w:gridCol w:w="1196"/>
+        <w:gridCol w:w="3938"/>
+      </w:tblGrid>
+      <w:tr>
+        <w:tc>
+          <w:tcPr>
+            <w:tcW w:w="4139" w:type="dxa"/>
+            <w:tcBorders>
+              <w:bottom w:val="single" w:sz="4" w:space="0" w:color="auto"/>
+            </w:tcBorders>
+          </w:tcPr>
+          <w:p>
+            <w:pPr>
+              <w:rPr>
+                <w:rFonts w:ascii="Century Gothic" w:hAnsi="Century Gothic"/>
+                <w:lang w:val="de-CH"/>
+              </w:rPr>
+            </w:pPr>
+          </w:p>
+        </w:tc>
+        <w:tc>
+          <w:tcPr>
+            <w:tcW w:w="1248" w:type="dxa"/>
+          </w:tcPr>
+          <w:p>
+            <w:pPr>
+              <w:rPr>
+                <w:rFonts w:ascii="Century Gothic" w:hAnsi="Century Gothic"/>
+                <w:lang w:val="de-CH"/>
+              </w:rPr>
+            </w:pPr>
+          </w:p>
+        </w:tc>
+        <w:tc>
+          <w:tcPr>
+            <w:tcW w:w="4139" w:type="dxa"/>
+            <w:tcBorders>
+              <w:bottom w:val="single" w:sz="4" w:space="0" w:color="auto"/>
+            </w:tcBorders>
+          </w:tcPr>
+          <w:p>
+            <w:pPr>
+              <w:rPr>
+                <w:rFonts w:ascii="Century Gothic" w:hAnsi="Century Gothic"/>
+                <w:lang w:val="de-CH"/>
+              </w:rPr>
+            </w:pPr>
+          </w:p>
+        </w:tc>
+      </w:tr>
+      <w:tr>
+        <w:tc>
+          <w:tcPr>
+            <w:tcW w:w="4139" w:type="dxa"/>
+            <w:tcBorders>
+              <w:top w:val="single" w:sz="4" w:space="0" w:color="auto"/>
+            </w:tcBorders>
+          </w:tcPr>
+          <w:p>
+            <w:pPr>
+              <w:rPr>
+                <w:rFonts w:ascii="Century Gothic" w:hAnsi="Century Gothic"/>
+                <w:lang w:val="de-CH"/>
+              </w:rPr>
+            </w:pPr>
+          </w:p>
+          <w:p>
+            <w:pPr>
+              <w:rPr>
+                <w:rFonts w:ascii="Century Gothic" w:hAnsi="Century Gothic"/>
+                <w:lang w:val="de-CH"/>
+              </w:rPr>
+            </w:pPr>
+            <w:r>
+              <w:rPr>
+                <w:rFonts w:ascii="Century Gothic" w:hAnsi="Century Gothic"/>
+                <w:lang w:val="de-CH"/>
+              </w:rPr>
+              <w:t>M</w:t>
+            </w:r>
+            <w:r>
+              <w:rPr>
+                <w:rFonts w:ascii="Century Gothic" w:hAnsi="Century Gothic"/>
+                <w:lang w:val="de-CH"/>
+              </w:rPr>
+              <w:t>artial Theiler</w:t>
+            </w:r>
+          </w:p>
+        </w:tc>
+        <w:tc>
+          <w:tcPr>
+            <w:tcW w:w="1248" w:type="dxa"/>
+          </w:tcPr>
+          <w:p>
+            <w:pPr>
+              <w:rPr>
+                <w:rFonts w:ascii="Century Gothic" w:hAnsi="Century Gothic"/>
+                <w:lang w:val="de-CH"/>
+              </w:rPr>
+            </w:pPr>
+          </w:p>
+        </w:tc>
+        <w:tc>
+          <w:tcPr>
+            <w:tcW w:w="4139" w:type="dxa"/>
+            <w:tcBorders>
+              <w:top w:val="single" w:sz="4" w:space="0" w:color="auto"/>
+            </w:tcBorders>
+          </w:tcPr>
+          <w:p>
+            <w:pPr>
+              <w:rPr>
+                <w:rFonts w:ascii="Century Gothic" w:hAnsi="Century Gothic"/>
+                <w:lang w:val="de-CH"/>
+              </w:rPr>
+            </w:pPr>
+          </w:p>
+          <w:p>
+            <w:pPr>
+              <w:rPr>
+                <w:rFonts w:ascii="Century Gothic" w:hAnsi="Century Gothic"/>
+                <w:lang w:val="de-CH"/>
+              </w:rPr>
+            </w:pPr>
+            <w:r>
+              <w:rPr>
+                <w:rFonts w:ascii="Century Gothic" w:hAnsi="Century Gothic"/>
+                <w:lang w:val="de-CH"/>
+              </w:rPr>
+              <w:t>Michelle Scherrer</w:t>
+            </w:r>
+          </w:p>
+        </w:tc>
+      </w:tr>
+    </w:tbl>
     <w:p>
       <w:pPr>
         <w:rPr>
@@ -491,8 +760,8 @@
       </w:pPr>
     </w:p>
     <w:sectPr>
-      <w:headerReference w:type="default" r:id="rId8"/>
-      <w:footerReference w:type="default" r:id="rId9"/>
+      <w:headerReference w:type="default" r:id="rId12"/>
+      <w:footerReference w:type="default" r:id="rId13"/>
       <w:pgSz w:w="11906" w:h="16838"/>
       <w:pgMar w:top="2785" w:right="1417" w:bottom="1702" w:left="1417" w:header="567" w:footer="143" w:gutter="0"/>
       <w:cols w:space="708"/>
@@ -648,71 +917,13 @@
     </w:pPr>
     <w:r>
       <w:rPr>
-        <w:noProof/>
-        <w:lang w:val="de-CH" w:eastAsia="de-CH"/>
-      </w:rPr>
-      <w:drawing>
-        <wp:anchor distT="0" distB="0" distL="114300" distR="114300" simplePos="0" relativeHeight="251659264" behindDoc="0" locked="0" layoutInCell="1" allowOverlap="1" wp14:anchorId="1DA7D21B" wp14:editId="4A3426CE">
-          <wp:simplePos x="0" y="0"/>
-          <wp:positionH relativeFrom="margin">
-            <wp:align>right</wp:align>
-          </wp:positionH>
-          <wp:positionV relativeFrom="paragraph">
-            <wp:posOffset>11430</wp:posOffset>
-          </wp:positionV>
-          <wp:extent cx="1981200" cy="1135380"/>
-          <wp:effectExtent l="0" t="0" r="0" b="7620"/>
-          <wp:wrapNone/>
-          <wp:docPr id="2003100856" name="Bild 1" descr="Kunz Sport Willisau"/>
-          <wp:cNvGraphicFramePr/>
-          <a:graphic xmlns:a="http://schemas.openxmlformats.org/drawingml/2006/main">
-            <a:graphicData uri="http://schemas.openxmlformats.org/drawingml/2006/picture">
-              <pic:pic xmlns:pic="http://schemas.openxmlformats.org/drawingml/2006/picture">
-                <pic:nvPicPr>
-                  <pic:cNvPr id="1" name="Bild 1" descr="Kunz Sport Willisau"/>
-                  <pic:cNvPicPr/>
-                </pic:nvPicPr>
-                <pic:blipFill>
-                  <a:blip r:embed="rId1">
-                    <a:extLst>
-                      <a:ext uri="{28A0092B-C50C-407E-A947-70E740481C1C}">
-                        <a14:useLocalDpi xmlns:a14="http://schemas.microsoft.com/office/drawing/2010/main" val="0"/>
-                      </a:ext>
-                    </a:extLst>
-                  </a:blip>
-                  <a:srcRect/>
-                  <a:stretch>
-                    <a:fillRect/>
-                  </a:stretch>
-                </pic:blipFill>
-                <pic:spPr bwMode="auto">
-                  <a:xfrm>
-                    <a:off x="0" y="0"/>
-                    <a:ext cx="1981200" cy="1135380"/>
-                  </a:xfrm>
-                  <a:prstGeom prst="rect">
-                    <a:avLst/>
-                  </a:prstGeom>
-                  <a:noFill/>
-                  <a:ln>
-                    <a:noFill/>
-                  </a:ln>
-                </pic:spPr>
-              </pic:pic>
-            </a:graphicData>
-          </a:graphic>
-        </wp:anchor>
-      </w:drawing>
-    </w:r>
-    <w:r>
-      <w:rPr>
         <w:rFonts w:ascii="BankGothic Md BT" w:hAnsi="BankGothic Md BT"/>
         <w:b/>
         <w:noProof/>
         <w:lang w:val="de-CH"/>
       </w:rPr>
       <w:drawing>
-        <wp:inline distT="0" distB="0" distL="0" distR="0" wp14:anchorId="4B032B87" wp14:editId="3A1E4527">
+        <wp:inline distT="0" distB="0" distL="0" distR="0" wp14:anchorId="4B032B87" wp14:editId="329748E4">
           <wp:extent cx="2298700" cy="1310249"/>
           <wp:effectExtent l="0" t="0" r="6350" b="4445"/>
           <wp:docPr id="248411392" name="Grafik 2"/>
@@ -729,7 +940,7 @@
                   </pic:cNvPicPr>
                 </pic:nvPicPr>
                 <pic:blipFill>
-                  <a:blip r:embed="rId2">
+                  <a:blip r:embed="rId1">
                     <a:extLst>
                       <a:ext uri="{28A0092B-C50C-407E-A947-70E740481C1C}">
                         <a14:useLocalDpi xmlns:a14="http://schemas.microsoft.com/office/drawing/2010/main" val="0"/>
@@ -775,20 +986,6 @@
         <w:sz w:val="24"/>
         <w:szCs w:val="24"/>
         <w:lang w:val="de-DE"/>
-      </w:rPr>
-    </w:pPr>
-  </w:p>
-  <w:p>
-    <w:pPr>
-      <w:pStyle w:val="Kopfzeile"/>
-      <w:tabs>
-        <w:tab w:val="clear" w:pos="4536"/>
-        <w:tab w:val="left" w:pos="1260"/>
-      </w:tabs>
-      <w:rPr>
-        <w:rFonts w:ascii="BankGothicBT" w:hAnsi="BankGothicBT"/>
-        <w:sz w:val="20"/>
-        <w:szCs w:val="20"/>
       </w:rPr>
     </w:pPr>
   </w:p>
@@ -1315,6 +1512,70 @@
 </w:styles>
 </file>
 
+<file path=word/ink/ink1.xml><?xml version="1.0" encoding="utf-8"?>
+<inkml:ink xmlns:inkml="http://www.w3.org/2003/InkML">
+  <inkml:definitions>
+    <inkml:context xml:id="ctx0">
+      <inkml:inkSource xml:id="inkSrc0">
+        <inkml:traceFormat>
+          <inkml:channel name="X" type="integer" min="-2.14748E9" max="2.14748E9" units="cm"/>
+          <inkml:channel name="Y" type="integer" min="-2.14748E9" max="2.14748E9" units="cm"/>
+          <inkml:channel name="F" type="integer" max="32767" units="dev"/>
+        </inkml:traceFormat>
+        <inkml:channelProperties>
+          <inkml:channelProperty channel="X" name="resolution" value="1000" units="1/cm"/>
+          <inkml:channelProperty channel="Y" name="resolution" value="1000" units="1/cm"/>
+          <inkml:channelProperty channel="F" name="resolution" value="0" units="1/dev"/>
+        </inkml:channelProperties>
+      </inkml:inkSource>
+      <inkml:timestamp xml:id="ts0" timeString="2026-05-27T09:18:59.831"/>
+    </inkml:context>
+    <inkml:brush xml:id="br0">
+      <inkml:brushProperty name="width" value="0.1" units="cm"/>
+      <inkml:brushProperty name="height" value="0.1" units="cm"/>
+    </inkml:brush>
+  </inkml:definitions>
+  <inkml:trace contextRef="#ctx0" brushRef="#br0">1 1544 8192,'0'-7'11468,"103"-663"-19018,-32 363 2525,-30 141 7122,-5 0 7717,-31 138-9401,6-25-287,6-89-1,-17 142-125,0 0 0,0 1 0,0-1 0,0 0 0,0 0 0,1 0 0,-1 0 0,0 0 0,0 0 0,0 0 0,0 0 0,0 0 0,0 0 0,0 0 0,1 0 0,-1 0 0,0 0 0,0 0 0,0 0 0,0 0 0,0 0 0,0 0 0,1 0 0,-1 0 0,0 0 0,0 0 0,0-1 0,0 1 0,0 0 0,0 0 0,0 0 0,0 0 0,1 0 0,-1 0 0,0 0 0,0 0 0,0 0 0,0-1 0,0 1 0,0 0 0,0 0 0,0 0 0,0 0 0,0 0 0,0 0 0,0 0 0,0-1 0,0 1 0,0 0 0,0 0 0,0 0 0,0 0 0,0 0 0,0 0 0,0-1 0,0 1 0,0 0 0,0 0 0,0 0 0,0 0 0,0 0 0,0 0 0,0 0 0,0-1 0,0 1 0,0 0 0,-1 0 0,1 0 0,0 0 0,7 12 0,6 19 0,22 78-241,22 115-1,6 116-990,26 115-1026,-84-434 1859,0 3 1274,1-1-1,2 0 0,0 0 1,13 25-1,-21-47-874,1 0 0,-1-1 0,0 1 0,1-1 0,-1 1 0,0-1 0,1 1 0,-1-1 0,0 1 0,1-1 0,-1 1 0,1-1 0,-1 1 0,1-1 0,-1 0 0,1 1 0,-1-1 0,1 0 0,-1 1 0,1-1 0,0 0 0,-1 0 0,1 0 0,-1 1 0,1-1 0,0 0 0,-1 0 0,1 0 0,0 0 0,-1 0 0,1 0 0,0 0 0,-1 0 0,1-1 0,-1 1 0,1 0 0,0 0 0,-1 0 0,1-1 0,-1 1 0,1 0 0,-1-1 0,1 1 0,-1 0 0,1-1 0,-1 1 0,1-1 0,-1 1 0,1-1 0,-1 1 0,0-1 0,1 1 0,-1-1 0,1 0 0,3-6 0,1 0 0,-2 0 0,6-11 0,-7 13 0,42-104-4417,54-211 0,-42 124 1783,14-5 4045,7-24 1718,-75 215-1744,1-1 1,-1 1 0,-1 0 0,1-15-1,-2 25-1385,0 0 0,1 0 0,-1 0 0,0 0 0,0 0 0,0 0 0,0 0 0,0 1 0,0-1 0,0 0 0,1 0 0,-1 0 0,0 0 0,0 0 0,0 0 0,0 0 0,0 0 0,1 0 0,-1 0 0,0 0 0,0 0 0,0 0 0,0 0 0,1 0 0,-1 0 0,0 0 0,0 0 0,0 0 0,0 0 0,0 0 0,1 0 0,-1 0 0,0 0 0,0-1 0,0 1 0,0 0 0,0 0 0,0 0 0,0 0 0,1 0 0,-1 0 0,0 0 0,0 0 0,0-1 0,0 1 0,0 0 0,0 0 0,0 0 0,0 0 0,0 0 0,0-1 0,0 1 0,0 0 0,0 0 0,7 13 0,18 168-690,-15-94 467,47 491-6482,-24-220 3567,-26-296 9584,-5-48-5852</inkml:trace>
+  <inkml:trace contextRef="#ctx0" brushRef="#br0" timeOffset="544.36">1502 1369 8192,'0'0'0</inkml:trace>
+  <inkml:trace contextRef="#ctx0" brushRef="#br0" timeOffset="1566.67">2399 335 8192,'-17'-15'9851,"8"6"-8234,-2 1-1617,-1 0 0,0 1 0,-1 1 0,0 0 0,0 0 0,0 2 0,0-1 0,-1 2 0,0 0 0,0 0 0,0 2 0,0-1 0,-24 2 0,18 1 0,-1 1 0,1 0 0,-1 2 0,1 0 0,0 1 0,0 1 0,0 1 0,-30 16 0,39-17 0,1 0 0,0 1 0,1 0 0,0 0 0,0 1 0,-9 10 0,16-16 0,0 1 0,0-1 0,1 0 0,-1 1 0,1-1 0,0 1 0,-1 0 0,1-1 0,1 1 0,-1 0 0,0 0 0,0-1 0,1 5 0,0-5 0,0 0 0,0 0 0,1 0 0,-1 0 0,1 0 0,0 0 0,-1 0 0,1 0 0,0 0 0,0 0 0,0 0 0,0-1 0,1 1 0,-1 0 0,0-1 0,1 1 0,-1-1 0,1 1 0,0-1 0,2 2 0,14 8 0,1-1 0,0 0 0,0-2 0,1 0 0,0-1 0,28 6 0,16 6 0,-34-9 0,0 2 0,0 1 0,-2 1 0,1 2 0,-2 1 0,0 1 0,-2 1 0,0 1 0,30 31 0,-41-36 0,-1 1 0,0 0 0,-2 1 0,1 0 0,-2 1 0,0 1 0,-2-1 0,0 1 0,-1 1 0,0-1 0,-2 1 0,0 0 0,-2 1 0,0-1 0,0 34 0,-4-34-521,-1 0 0,0 0-1,-2 0 1,-1 0 0,0-1-1,-1 0 1,-1 0 0,-1 0 0,0-1-1,-14 20 1,14-23 80,-1-2 0,-1 1 0,0-1 0,-1-1 0,-1 0-1,1 0 1,-2-2 0,0 1 0,0-1 0,-1-1 0,0 0 0,-28 12 0,31-18 441,0 1 0,0-1 0,-1-1 0,1 0 0,-1 0 0,0-2 0,0 1 0,-19-3 0,13 0 0,1-1 0,-1-1 0,1 0 0,0-2 0,-19-8 0,6 0 0,2-1 0,0-2 0,1-1 0,1-1 0,-45-42 0,46 37 0,2-2 0,1-1 0,1-1 0,2 0 0,0-1 0,-21-49 0,20 32 0,2-1 0,3-1 0,-18-88 0,11-2 0</inkml:trace>
+  <inkml:trace contextRef="#ctx0" brushRef="#br0" timeOffset="39667.63">3027 832 8192,'-4'-3'11314,"-7"-8"-11438,6 5 402,0 2-278,0 0 0,0 0 0,-1 1 0,0-1 0,1 1 0,-1 0 0,0 1 0,0 0 0,0 0 0,-1 0 0,1 0 0,0 1 0,-1 0 0,1 1 0,-1-1 0,-11 2 0,9 0 0,0 1 0,1 0 0,-1 0 0,1 1 0,-1 0 0,1 1 0,0 0 0,0 0 0,0 0 0,1 1 0,-13 11 0,7-4-441,1 0 0,1 1 0,0 1 0,0 0 0,2 0 0,0 1 0,0 0-1,1 1 1,1 0 0,1 0 0,0 1 0,-4 22 0,4-15-276,2 2 0,1-1 1,0 0-1,2 1 0,1-1 0,1 1 1,8 45-1,-7-63 1195,0 0-1,0 0 1,0 0 0,1 0 0,0 0 0,1-1 0,0 1 0,0-1-1,1 0 1,-1-1 0,10 10 0,-11-12-191,1-1-1,1 1 1,-1-1 0,0-1 0,1 1-1,0 0 1,-1-1 0,1 0-1,0 0 1,0-1 0,0 1 0,0-1-1,1 0 1,-1 0 0,0-1-1,0 0 1,1 0 0,-1 0-1,6-1 1,0-1-318,0 0 0,0-1 0,-1 0 0,1 0 1,0-2-1,-1 1 0,0-1 0,0-1 0,10-7 0,13-11 60,36-35-1,-4 3 224,-54 48-252,-1-1 0,0-1 0,12-16 0,-17 20 0</inkml:trace>
+  <inkml:trace contextRef="#ctx0" brushRef="#br0" timeOffset="76049.49">3360 250 8192,'-2'3'11658,"-10"13"-11848,5 1 190,2 1 0,0 1 0,1-1 0,1 1 0,0 0 0,1 34 0,1-29 0,8 390 0,-1 10 0,-12-359 0,2-31 0,1 48 0,0-147-2293,3 0-1,3 0 0,3 1 0,17-80 1,-17 120 2339,1 1 0,2 0 1,0 1-1,2 0 0,16-27 0,-18 34 104,1 1 0,1 0 1,0 1-1,0 0 0,2 0 0,0 2 0,0-1 0,17-10 0,-22 17 1540,-1 1 1,1 1 0,0-1-1,13-3 1,-12 5-1455,0 0 0,-1 1 0,1 0 0,0 0 0,0 1 0,0 0 1,14 2-1,-17-1-297,0 0 0,1 0 1,-1 1-1,0 0 0,0 0 0,0 0 1,0 1-1,-1 0 0,1 0 1,-1 1-1,1 0 0,-1-1 1,0 2-1,0-1 0,-1 1 1,0-1-1,1 1 0,-2 0 1,7 10-1,-3-1-516,-1 1 1,-1 0-1,0 0 1,-1 1 0,0-1-1,-1 1 1,1 26-1,-5 117-5337,-1-131 5684,0 19 609,-5 211 6127,7-248-5912</inkml:trace>
+  <inkml:trace contextRef="#ctx0" brushRef="#br0" timeOffset="78843.64">4015 1114 8192,'0'0'11468,"19"-6"-11468,20-1 0,60-2 0,15-2 0,-106 10 0,73-16 0,-70 15 0,-1-1 0,0-1 0,0 0 0,0-1 0,15-8 0,-25 12 0,1 0 0,0 1 0,-1-1 0,1 0 0,0 1 0,-1-1 0,1 0 0,-1 0 0,1 1 0,-1-1 0,1 0 0,-1 0 0,0 0 0,1 0 0,-1 0 0,0 0 0,0 0 0,1 0 0,-1 0 0,0 0 0,0 1 0,0-1 0,0 0 0,0 0 0,-1 0 0,1 0 0,0 0 0,0 0 0,-1 0 0,1 0 0,0 0 0,-1 0 0,1 1 0,-1-1 0,1 0 0,-1 0 0,1 0 0,-1 1 0,0-1 0,1 0 0,-3 0 0,-4-7 0,0 1 0,-1 0 0,-9-6 0,6 4 0,-12-12-427,10 10 554,1 0 0,-1 1 0,-27-16 0,35 24-542,1-1 0,-1 1 0,0 1 1,0-1-1,-1 1 0,-7-1 1,8 1-389,1 1 0,-1 0 1,1 1-1,-1-1 0,1 1 1,0 0-1,-1 0 0,1 0 1,-4 2-1,-1 0 759,1 1 0,0 0-1,1 0 1,-1 1 0,1 0 0,0 1-1,0-1 1,1 1 0,-1 1 0,1-1-1,1 1 1,-1 0 0,-7 13 0,7-8 27,1-1-1,0 1 1,1 0 0,0 0 0,1 0 0,0 1-1,1-1 1,-1 25 0,3-14 31,1 0 0,1 0 0,1-1 0,1 1 0,1-1 0,1 0 0,1 0 1,0 0-1,2-1 0,15 27 0,-16-35 487,1 0 0,0 0-1,0-1 1,1 0 0,1-1 0,0 0 0,0-1 0,1 0 0,0-1 0,15 8 0,-22-14-324,1 0 1,0 0 0,1 0 0,-1-1-1,0 0 1,1 0 0,-1-1 0,1 0-1,-1 0 1,1 0 0,0-1 0,-1 0-1,1 0 1,0-1 0,-1 0-1,1 0 1,-1 0 0,1-1 0,-1 0-1,0 0 1,1-1 0,-1 0 0,0 0-1,-1 0 1,8-6 0,6-6-965,0-1 0,-2-1-1,0-1 1,-1 0 0,-1-1 0,15-24 0,67-132-3834,-65 109 4621,-7 7 0</inkml:trace>
+  <inkml:trace contextRef="#ctx0" brushRef="#br0" timeOffset="80195.92">4743 903 8192,'0'4'11212,"1"10"-11126,0-7 84,38 329-170,-15-146 0,-23-183 0,0-5 0,-1 1 0,1-1 0,-1 1 0,1 0 0,-1-1 0,0 1 0,0-1 0,0 1 0,-1 0 0,1-1 0,0 1 0,-1-1 0,-1 5 0,0-10 0,0 1 0,0-1 0,1 1 0,-1-1 0,1 0 0,-1 0 0,0-4 0,-5-16 0,1 1 0,0-1 0,2-1 0,1 1 0,1 0 0,1-26 0,3 18 0,0-1 0,2 1 0,1 1 0,10-34 0,-12 54 0,0 1 0,1 0 0,0 0 0,0 0 0,1 0 0,0 1 0,0 0 0,1 0 0,0 0 0,1 1 0,0 0 0,0 0 0,11-8 0,-6 7 0,-1 1 0,2 0 0,-1 1 0,1 1 0,0 0 0,0 0 0,0 2 0,27-5 0,23-4 0,-55 10 0</inkml:trace>
+  <inkml:trace contextRef="#ctx0" brushRef="#br0" timeOffset="81410.95">5282 1005 8192,'1'34'10605,"6"18"-9341,0 4-1665,-7-48 401,10 181 0,-10-156 0,-2 0 0,-1 0 0,-12 56 0,0-145-186,2-27-839,1-47-5390,12 99 4736,1 1 0,5-39 0,-2 49 2153,0 1 1,9-24-1,-10 36-462,-1 0 0,2 0 0,-1 0 1,1 0-1,0 1 0,1-1 0,-1 1 0,1 0 0,0 1 1,1-1-1,0 1 0,-1 0 0,2 0 0,-1 1 0,0 0 1,1 0-1,0 0 0,0 1 0,10-4 0,-2 3-23,0 1 0,0 0 0,0 1 0,0 0 0,1 2 0,-1 0 0,0 0 0,28 5 0,37 9 7112,-73-13-7101</inkml:trace>
+  <inkml:trace contextRef="#ctx0" brushRef="#br0" timeOffset="82780.72">5533 1362 8192,'0'0'9557,"26"-5"-7646,26-11-1911,0-2 0,-2-3 0,80-44 0,-115 56 0,0 0 0,0-1 0,-1 0 0,25-25 0,-35 32 0,-1 0 0,0 0 0,0-1 0,0 0 0,0 0 0,-1 1 0,1-1 0,-1-1 0,0 1 0,0 0 0,-1 0 0,1-1 0,-1 1 0,0-1 0,0 0 0,0 1 0,-1-1 0,0 1 0,0-1 0,0 0 0,0 1 0,-1-1 0,-1-8 0,0 9-92,0 0 1,0 1-1,0-1 0,-1 0 0,1 1 0,-1-1 0,0 1 1,0 0-1,0 0 0,-1 0 0,1 0 0,-1 0 0,1 1 1,-1 0-1,0-1 0,0 2 0,0-1 0,0 0 1,0 1-1,-1 0 0,1-1 0,-8 1 0,3-1-698,0 1-1,-1 1 1,1-1-1,0 1 1,0 1 0,0 0-1,0 0 1,0 1-1,0 0 1,-10 4-1,9-1 773,1 0-1,-1 1 1,1 0-1,0 0 1,0 1-1,1 0 1,0 1-1,0-1 1,1 2-1,0-1 0,0 1 1,1 0-1,0 0 1,1 1-1,0 0 1,0 0-1,1 0 1,0 0-1,-2 13 1,2-6 70,0-1-1,1 1 1,1 0 0,1 1 0,0-1 0,1 0 0,1 0-1,1 0 1,0 1 0,1-2 0,8 28 0,-9-39 337,0-1 1,-1 1 0,2-1 0,-1 1 0,0-1 0,1 0 0,0 0 0,0 0 0,0 0 0,0 0-1,1-1 1,6 6 0,-8-8-238,0 0-1,0 0 1,1 0-1,-1 0 0,0 0 1,1-1-1,-1 1 1,1-1-1,-1 0 1,0 1-1,1-1 1,-1 0-1,1 0 0,-1-1 1,1 1-1,-1-1 1,1 1-1,-1-1 1,0 0-1,1 0 0,-1 0 1,0 0-1,0 0 1,0 0-1,1 0 1,2-4-1,5-2-1247,0-1 0,0-1 0,-1 1 0,-1-2 0,1 1-1,7-12 1,-5 4 375,-1 0 0,-1-1 0,10-24 0,-6 6 1786,-1-1 1,-3-1 0,8-55-1,-12 52 2190,-8 54-2803,-1 1 0,-10 25 0,4-11-1145,-6 17-92,-15 48-1984,-70 143-1,131-263 10958,217-208-6733,-16 28-1954,72-45 742,48-23-1153,-9 16 635</inkml:trace>
+</inkml:ink>
+</file>
+
+<file path=word/ink/ink2.xml><?xml version="1.0" encoding="utf-8"?>
+<inkml:ink xmlns:inkml="http://www.w3.org/2003/InkML">
+  <inkml:definitions>
+    <inkml:context xml:id="ctx0">
+      <inkml:inkSource xml:id="inkSrc0">
+        <inkml:traceFormat>
+          <inkml:channel name="X" type="integer" min="-2.14748E9" max="2.14748E9" units="cm"/>
+          <inkml:channel name="Y" type="integer" min="-2.14748E9" max="2.14748E9" units="cm"/>
+          <inkml:channel name="F" type="integer" max="32767" units="dev"/>
+        </inkml:traceFormat>
+        <inkml:channelProperties>
+          <inkml:channelProperty channel="X" name="resolution" value="1000" units="1/cm"/>
+          <inkml:channelProperty channel="Y" name="resolution" value="1000" units="1/cm"/>
+          <inkml:channelProperty channel="F" name="resolution" value="0" units="1/dev"/>
+        </inkml:channelProperties>
+      </inkml:inkSource>
+      <inkml:timestamp xml:id="ts0" timeString="2026-05-27T09:11:12.526"/>
+    </inkml:context>
+    <inkml:brush xml:id="br0">
+      <inkml:brushProperty name="width" value="0.1" units="cm"/>
+      <inkml:brushProperty name="height" value="0.1" units="cm"/>
+    </inkml:brush>
+  </inkml:definitions>
+  <inkml:trace contextRef="#ctx0" brushRef="#br0">176 290 24575,'-4'4'0,"0"1"0,0 0 0,0 0 0,1 0 0,0 0 0,0 1 0,0-1 0,1 1 0,-1 0 0,1 0 0,-2 10 0,0 8 0,-3 42 0,5-36 0,-42 620 0,12-148 0,14-295 0,-12 198 0,30-384 0,0-21 0,0 0 0,0 0 0,0 0 0,1 0 0,-1 0 0,0 0 0,0 0 0,0 0 0,0 0 0,0 0 0,0 0 0,0 0 0,0 0 0,0 0 0,0 0 0,0 0 0,0 0 0,1 0 0,-1 0 0,0 0 0,0 0 0,0 0 0,0 0 0,0 0 0,0 0 0,0 0 0,0 1 0,0-1 0,0 0 0,0 0 0,0 0 0,0 0 0,0 0 0,0 0 0,1 0 0,-1 0 0,0 0 0,0 0 0,0 0 0,0 0 0,0 0 0,0 0 0,0 0 0,0 1 0,0-1 0,0 0 0,0 0 0,0 0 0,0 0 0,0 0 0,0 0 0,0 0 0,0 0 0,0 0 0,0 0 0,9-31 0,-5 17 0,94-329 0,197-455 0,-200 598 0,-74 163 0,1 0 0,2 2 0,30-35 0,-53 68 0,6-6 0,1 0 0,0 0 0,12-9 0,-19 16 0,1 0 0,-1 0 0,0 0 0,0 0 0,1 0 0,-1 0 0,0 1 0,1-1 0,-1 1 0,1-1 0,-1 1 0,1-1 0,-1 1 0,1 0 0,0-1 0,-1 1 0,1 0 0,-1 0 0,1 0 0,-1 1 0,1-1 0,-1 0 0,1 0 0,-1 1 0,1-1 0,-1 1 0,1-1 0,-1 1 0,1 0 0,-1 0 0,0 0 0,3 1 0,-2 1 0,0 0 0,1 0 0,-1 0 0,0 1 0,-1-1 0,1 0 0,-1 1 0,1-1 0,-1 1 0,0 0 0,0 4 0,5 50 0,-6-54 0,1 72 0,-15 135 0,-30 77 0,42-279 0,-141 660 0,141-662 32,-7 43-1429</inkml:trace>
+  <inkml:trace contextRef="#ctx0" brushRef="#br0" timeOffset="529.89">1252 1693 24575,'0'0'0</inkml:trace>
+  <inkml:trace contextRef="#ctx0" brushRef="#br0" timeOffset="1622.18">2031 757 24575,'-2'14'0,"-12"364"0,12-228 0,-2 74 0,-22 555 0,23-756 0,1-22 0,0-5 0,-5-42 0,-9-209-311,25-397 0,57 50 176,-41 472 139,6 1-1,72-194 1,-90 290-4,1 0 0,35-58 0,-47 88 0,0-1 0,1 1 0,-1 0 0,1 0 0,0 0 0,4-3 0,-7 5 0,1 1 0,-1 0 0,0 0 0,1-1 0,-1 1 0,1 0 0,0 0 0,-1-1 0,1 1 0,-1 0 0,1 0 0,-1 0 0,1 0 0,-1 0 0,1 0 0,-1 0 0,1 0 0,0 0 0,-1 0 0,2 1 0,-1-1 0,-1 1 0,1 0 0,0-1 0,0 1 0,0 0 0,-1-1 0,1 1 0,0 0 0,-1 0 0,1 0 0,0 0 0,-1 0 0,0 0 0,1-1 0,0 3 0,4 14 72,-1 1 0,0 0 0,-2 0 0,0 0 0,0 0 0,-3 31 0,1-11 46,-37 912-843,2-265 650,34-642 75,-1 131 0,4-135 0,2-1 0,12 55 0,-15-86-1,1 0 0,-1-1 0,2 1 0,-1 0-1,1-1 1,0 0 0,0 1 0,1-1 0,0-1 0,9 12 0,-10-15 9,0 1 0,0-1-1,1 1 1,-1-1 0,1 0 0,0-1 0,0 1 0,-1-1 0,1 1 0,0-1 0,0 0 0,0-1 0,0 1 0,1-1 0,-1 0 0,0 0-1,0 0 1,0 0 0,0-1 0,5 0 0,12-4 114,0 0-1,-1-1 0,33-14 1,65-38 161,-110 54-282,445-251-305,-19 10-216,-293 173 382,168-59 0,-254 112-59,1 2 0,0 3 0,1 2 0,1 3 0,87-3 0,35 16-5712</inkml:trace>
+</inkml:ink>
+</file>
+
 <file path=word/theme/theme1.xml><?xml version="1.0" encoding="utf-8"?>
 <a:theme xmlns:a="http://schemas.openxmlformats.org/drawingml/2006/main" name="Office">
   <a:themeElements>

</xml_diff>